<commit_message>
Add Patal Loka Chapter 14
</commit_message>
<xml_diff>
--- a/manuscript/chapter-08-the-silence.docx
+++ b/manuscript/chapter-08-the-silence.docx
@@ -292,6 +292,15 @@
     <w:p>
       <w:r>
         <w:t>Elara went quiet. The gravity of the cards, the language, and the people gathered around the table made the larger forces moving through histories and consequences impossible to ignore.</w:t>
+      </w:r>
+    </w:p>
+    <w:p>
+      <w:r>
+        <w:rPr>
+          <w:i/>
+          <w:color w:val="5C6B7D"/>
+        </w:rPr>
+        <w:t>Below, Gage was carrying a different danger toward the shack. Badge 732—the man who had hit Otto in the dark—had accepted an invitation to dinner. The boys had survived by staying together; now they were deciding whether trust could survive being extended.</w:t>
       </w:r>
     </w:p>
     <w:p>

</xml_diff>

<commit_message>
Ch8 Sanskrit fixes (dignified intro, referent) + tracker: review in progress mid-Chapter 7
</commit_message>
<xml_diff>
--- a/manuscript/chapter-08-the-silence.docx
+++ b/manuscript/chapter-08-the-silence.docx
@@ -8,7 +8,6 @@
       </w:pPr>
       <w:r>
         <w:rPr>
-          <w:b/>
           <w:color w:val="000000"/>
         </w:rPr>
         <w:t>Chapter 8: The Silence</w:t>
@@ -50,7 +49,10 @@
     </w:p>
     <w:p>
       <w:r>
-        <w:t>The effect was instant and violent. Elara's chest lurched upward with a desperate gasp as her lungs seized, then opened. She bent over the table, clutching her collar as ragged breaths tore at her throat; it felt like drowning and being dragged back onto a deck at the same time. Her body still shuddered, her eyes watered, and her pulse thundered as she forced herself upright. Then she understood what the room had seen: the elder woman had tested control from inside her body, treating Elara's ability to speak and breathe as something the committee could grant or withhold. Lowering her hand did not soften the lesson. It confirmed that her panic had been instruction, a deliberate demonstration.</w:t>
+        <w:t>The effect was instant and violent. Elara's chest lurched upward with a desperate gasp as her lungs seized, then opened. She bent over the table, clutching her collar as ragged breaths tore at her throat; it felt like drowning and being dragged back onto a deck at the same time. Her body still shuddered, her eyes watered, and her pulse thundered as she forced herself upright. Then she understood what the room had seen: the elder woman had tested control from inside her body, treating Elara's ability to spea</w:t>
+      </w:r>
+      <w:r>
+        <w:t>k and breathe as something the committee could grant or withhold. Lowering her hand did not soften the lesson. It confirmed that her panic had been instruction, a deliberate demonstration.</w:t>
       </w:r>
     </w:p>
     <w:p>
@@ -70,7 +72,119 @@
     </w:p>
     <w:p>
       <w:r>
-        <w:t>And then, at last, the elder woman said in Sanskrit, "मोनितोरा नातन, अधुना वक्तुं अर्हसि। अपि च, यानि अस्माभिः परिकल्पितानि प्रश्नानि तानि एव तेऽभ्युपगच्छन्तु, न तु स्वस्यात्मनः परिकल्पितानि।"</w:t>
+        <w:t xml:space="preserve">And then, at last, the elder woman spoke, and the words came in Sanskrit — the oldest of the carried tongues, the language in which knowledge had first passed from teacher to student by voice alone, each syllable engineered for precision and kept alive through millennia of recitation. It was the language of the scriptures in Vishnu's cabinet, older than </w:t>
+      </w:r>
+      <w:r>
+        <w:lastRenderedPageBreak/>
+        <w:t>Trinity, older than the cities Trinity had replaced. "</w:t>
+      </w:r>
+      <w:r>
+        <w:t>मोनितोरा</w:t>
+      </w:r>
+      <w:r>
+        <w:t xml:space="preserve"> </w:t>
+      </w:r>
+      <w:r>
+        <w:t>नातन</w:t>
+      </w:r>
+      <w:r>
+        <w:t xml:space="preserve">, </w:t>
+      </w:r>
+      <w:r>
+        <w:t>अधुना</w:t>
+      </w:r>
+      <w:r>
+        <w:t xml:space="preserve"> </w:t>
+      </w:r>
+      <w:r>
+        <w:t>वक्तुं</w:t>
+      </w:r>
+      <w:r>
+        <w:t xml:space="preserve"> </w:t>
+      </w:r>
+      <w:r>
+        <w:t>अर्हसि।</w:t>
+      </w:r>
+      <w:r>
+        <w:t xml:space="preserve"> </w:t>
+      </w:r>
+      <w:r>
+        <w:t>अपि</w:t>
+      </w:r>
+      <w:r>
+        <w:t xml:space="preserve"> </w:t>
+      </w:r>
+      <w:r>
+        <w:t>च</w:t>
+      </w:r>
+      <w:r>
+        <w:t xml:space="preserve">, </w:t>
+      </w:r>
+      <w:r>
+        <w:t>यानि</w:t>
+      </w:r>
+      <w:r>
+        <w:t xml:space="preserve"> </w:t>
+      </w:r>
+      <w:r>
+        <w:t>अस्माभिः</w:t>
+      </w:r>
+      <w:r>
+        <w:t xml:space="preserve"> </w:t>
+      </w:r>
+      <w:r>
+        <w:t>परिकल्पितानि</w:t>
+      </w:r>
+      <w:r>
+        <w:t xml:space="preserve"> </w:t>
+      </w:r>
+      <w:r>
+        <w:t>प्रश्नानि</w:t>
+      </w:r>
+      <w:r>
+        <w:t xml:space="preserve"> </w:t>
+      </w:r>
+      <w:r>
+        <w:t>तानि</w:t>
+      </w:r>
+      <w:r>
+        <w:t xml:space="preserve"> </w:t>
+      </w:r>
+      <w:r>
+        <w:t>एव</w:t>
+      </w:r>
+      <w:r>
+        <w:t xml:space="preserve"> </w:t>
+      </w:r>
+      <w:r>
+        <w:t>तेओभ्युपगच्छन्तु</w:t>
+      </w:r>
+      <w:r>
+        <w:t xml:space="preserve">, </w:t>
+      </w:r>
+      <w:r>
+        <w:t>न</w:t>
+      </w:r>
+      <w:r>
+        <w:t xml:space="preserve"> </w:t>
+      </w:r>
+      <w:r>
+        <w:t>तु</w:t>
+      </w:r>
+      <w:r>
+        <w:t xml:space="preserve"> </w:t>
+      </w:r>
+      <w:r>
+        <w:t>स्वस्यात्मनः</w:t>
+      </w:r>
+      <w:r>
+        <w:t xml:space="preserve"> </w:t>
+      </w:r>
+      <w:r>
+        <w:t>परिकल्पितानि।</w:t>
+      </w:r>
+      <w:r>
+        <w:t>"</w:t>
       </w:r>
     </w:p>
     <w:p>
@@ -85,7 +199,7 @@
     </w:p>
     <w:p>
       <w:r>
-        <w:t>The words struck Elara with a second shock. They were not harsh, but they were older than Trinity's speech, and some part of her recognized them. The meaning stirred at the edge of her mind, familiar yet impossible to grasp.</w:t>
+        <w:t>It was not the translation that struck Elara — it was the Sanskrit itself. The syllables were not harsh, but they were older than Trinity's speech, and some part of her recognized them. Even before Kavik had spoken, the meaning had stirred at the edge of her mind, familiar yet impossible to grasp.</w:t>
       </w:r>
     </w:p>
     <w:p>
@@ -100,7 +214,10 @@
     </w:p>
     <w:p>
       <w:r>
-        <w:t>She should have expected that. Anandi had told her this in the early days at Drona Academy, before Elara had learned how much of wisdom was simply the ability to survive being humbled. "Just when you think you have seen it all," Anandi had said, her voice quiet and impossible to argue with, "life will throw you a surprise and remind you that you still have a very long way to go." Elara had laughed then, because she had been young and certain she was already learning the shape of the world. Now, with her breath still uneven and her throat raw from panic, she understood the lesson with the kind of clarity that only came after a fall.</w:t>
+        <w:t>She should have expected that. Anandi had told her this in the early days at Drona Academy, before Elara had learned how much of wisdom was simply the ability to survive being humbled. "Just when you think you have seen it all," Anandi had said, her voice quiet and impossible to argue with, "life will throw you a surprise and remind you that you still have a very long way to go." Elara had laughed then, because she had been young and certain she was already learning the shape of the world. Now, with her bre</w:t>
+      </w:r>
+      <w:r>
+        <w:t>ath still uneven and her throat raw from panic, she understood the lesson with the kind of clarity that only came after a fall.</w:t>
       </w:r>
     </w:p>
     <w:p>
@@ -120,7 +237,91 @@
     </w:p>
     <w:p>
       <w:r>
-        <w:t>"प्रवृत्तेः पूर्वम्," the elder woman said in Sanskrit. "अद्य अस्यां सभायाम् उपविष्टेभ्यः आचार्येभ्यः उचितम् आदरं दर्शयत। आचार्याः एकैकशः स्वपरिचयं कुर्वन्तु।"</w:t>
+        <w:t>"</w:t>
+      </w:r>
+      <w:r>
+        <w:t>प्रवृत्तेः</w:t>
+      </w:r>
+      <w:r>
+        <w:t xml:space="preserve"> </w:t>
+      </w:r>
+      <w:r>
+        <w:t>पूर्वम्</w:t>
+      </w:r>
+      <w:r>
+        <w:t>," the elder woman said in the same ancient cadence. "</w:t>
+      </w:r>
+      <w:r>
+        <w:t>अद्य</w:t>
+      </w:r>
+      <w:r>
+        <w:t xml:space="preserve"> </w:t>
+      </w:r>
+      <w:r>
+        <w:t>अस्यां</w:t>
+      </w:r>
+      <w:r>
+        <w:t xml:space="preserve"> </w:t>
+      </w:r>
+      <w:r>
+        <w:t>सभायाम्</w:t>
+      </w:r>
+      <w:r>
+        <w:t xml:space="preserve"> </w:t>
+      </w:r>
+      <w:r>
+        <w:t>उपविष्टेभ्यः</w:t>
+      </w:r>
+      <w:r>
+        <w:t xml:space="preserve"> </w:t>
+      </w:r>
+      <w:r>
+        <w:t>आचार्येभ्यः</w:t>
+      </w:r>
+      <w:r>
+        <w:t xml:space="preserve"> </w:t>
+      </w:r>
+      <w:r>
+        <w:t>उचितम्</w:t>
+      </w:r>
+      <w:r>
+        <w:t xml:space="preserve"> </w:t>
+      </w:r>
+      <w:r>
+        <w:t>आदरं</w:t>
+      </w:r>
+      <w:r>
+        <w:t xml:space="preserve"> </w:t>
+      </w:r>
+      <w:r>
+        <w:t>दर्शयत।</w:t>
+      </w:r>
+      <w:r>
+        <w:t xml:space="preserve"> </w:t>
+      </w:r>
+      <w:r>
+        <w:t>आचार्याः</w:t>
+      </w:r>
+      <w:r>
+        <w:t xml:space="preserve"> </w:t>
+      </w:r>
+      <w:r>
+        <w:t>एकैकशः</w:t>
+      </w:r>
+      <w:r>
+        <w:t xml:space="preserve"> </w:t>
+      </w:r>
+      <w:r>
+        <w:t>स्वपरिचयं</w:t>
+      </w:r>
+      <w:r>
+        <w:t xml:space="preserve"> </w:t>
+      </w:r>
+      <w:r>
+        <w:t>कुर्वन्तु।</w:t>
+      </w:r>
+      <w:r>
+        <w:t>"</w:t>
       </w:r>
     </w:p>
     <w:p>
@@ -130,6 +331,7 @@
     </w:p>
     <w:p>
       <w:r>
+        <w:lastRenderedPageBreak/>
         <w:t>The language was formal and hierarchical, placing the room above Elara before she had permission to speak and revealing that this was not a routine review but an initiation into an authority beyond Trinity's procedures and policies.</w:t>
       </w:r>
     </w:p>
@@ -165,12 +367,24 @@
     </w:p>
     <w:p>
       <w:r>
-        <w:t>"I am Draṣṭā, the seer," she said. "My duty is to know the three times: the past, the present, and the future. Nothing is certain, and I do not pretend otherwise. I guide the gana toward choices whose significance may reach much farther into tomorrow than what appears today."</w:t>
+        <w:t>"I am Dra</w:t>
+      </w:r>
+      <w:r>
+        <w:t>ṣṭ</w:t>
+      </w:r>
+      <w:r>
+        <w:t>ā, the seer," she said. "My duty is to know the three times: the past, the present, and the future. Nothing is certain, and I do not pretend otherwise. I guide the gana toward choices whose significance may reach much farther into tomorrow than what appears today."</w:t>
       </w:r>
     </w:p>
     <w:p>
       <w:r>
-        <w:t>The third was the elder woman at the end of the table, and the room seemed to arrange itself around her silence. Sarvajña carried the authority of knowledge, Draṣṭā the authority of perception, and Anandi and Kavik the authority of those who had shaped Elara's mind; this woman stood above those distinctions, as if the room's laws and lineages had gathered in her rather than the other way around. When she spoke, her voice did not claim the room. It revealed that the room had always been hers to convene.</w:t>
+        <w:t>The third was the elder woman at the end of the table, and the room seemed to arrange itself around her silence. Sarvajña carried the authority of knowledge, Dra</w:t>
+      </w:r>
+      <w:r>
+        <w:t>ṣṭ</w:t>
+      </w:r>
+      <w:r>
+        <w:t>ā the authority of perception, and Anandi and Kavik the authority of those who had shaped Elara's mind; this woman stood above those distinctions, as if the room's laws and lineages had gathered in her rather than the other way around. When she spoke, her voice did not claim the room. It revealed that the room had always been hers to convene.</w:t>
       </w:r>
     </w:p>
     <w:p>
@@ -185,6 +399,7 @@
     </w:p>
     <w:p>
       <w:r>
+        <w:lastRenderedPageBreak/>
         <w:t>The Grandmaster's gaze moved toward the two familiar faces. "You know, of course, your mentors Anandi and Kavik. They have guided you longer than you realize."</w:t>
       </w:r>
     </w:p>
@@ -195,17 +410,44 @@
     </w:p>
     <w:p>
       <w:r>
-        <w:t>The Grandmaster gave a small signal toward Draṣṭā. The seer gathered the cards into a single stack, then spread them across the table in a long, uneven fan. Their dark backs caught the light without revealing anything beneath them.</w:t>
+        <w:t>The Grandmaster gave a small signal toward Dra</w:t>
+      </w:r>
+      <w:r>
+        <w:t>ṣṭ</w:t>
+      </w:r>
+      <w:r>
+        <w:t>ā. The seer gathered the cards into a single stack, then spread them across the table in a long, uneven fan. Their dark backs caught the light without revealing anything beneath them.</w:t>
       </w:r>
     </w:p>
     <w:p>
       <w:r>
-        <w:t>"Choose one," Draṣṭā said.</w:t>
+        <w:t>"Choose one," Dra</w:t>
+      </w:r>
+      <w:r>
+        <w:t>ṣṭ</w:t>
+      </w:r>
+      <w:r>
+        <w:t>ā said.</w:t>
       </w:r>
     </w:p>
     <w:p>
       <w:r>
-        <w:t>Draṣṭā looked at her and smiled faintly. It was not an amused smile. It was the quiet expression of someone who had recognized Elara's confusion before Elara had found the words for it, as if the question had already crossed the space between them without being spoken.</w:t>
+        <w:rPr>
+          <w:highlight w:val="yellow"/>
+        </w:rPr>
+        <w:t>Dra</w:t>
+      </w:r>
+      <w:r>
+        <w:rPr>
+          <w:highlight w:val="yellow"/>
+        </w:rPr>
+        <w:t>ṣṭ</w:t>
+      </w:r>
+      <w:r>
+        <w:rPr>
+          <w:highlight w:val="yellow"/>
+        </w:rPr>
+        <w:t>ā looked at her and smiled faintly. It was not an amused smile. It was the quiet expression of someone who had recognized Elara's confusion before Elara had found the words for it, as if the question had already crossed the space between them without being spoken.</w:t>
       </w:r>
     </w:p>
     <w:p>
@@ -220,12 +462,24 @@
     </w:p>
     <w:p>
       <w:r>
-        <w:t>Draṣṭā took it from her fingers and unfolded it with deliberate care. The card showed a king suspended between a dark sky and the curve of the earth below him, neither ascending nor falling. Beneath the image, in old lettering, was a single name: *Trishanku*.</w:t>
+        <w:t>Dra</w:t>
+      </w:r>
+      <w:r>
+        <w:t>ṣṭ</w:t>
+      </w:r>
+      <w:r>
+        <w:t>ā took it from her fingers and unfolded it with deliberate care. The card showed a king suspended between a dark sky and the curve of the earth below him, neither ascending nor falling. Beneath the image, in old lettering, was a single name: *Trishanku*.</w:t>
       </w:r>
     </w:p>
     <w:p>
       <w:r>
-        <w:t>"King Trishanku," Draṣṭā said, a faint smile still resting at the edge of her mouth. "He was pushed out of heaven and prevented from falling back to earth, left fixed in the space between the two, belonging to neither. His condition is the condition of those who have been placed outside every available category."</w:t>
+        <w:t>"King Trishanku," Dra</w:t>
+      </w:r>
+      <w:r>
+        <w:t>ṣṭ</w:t>
+      </w:r>
+      <w:r>
+        <w:t>ā said, a faint smile still resting at the edge of her mouth. "He was pushed out of heaven and prevented from falling back to earth, left fixed in the space between the two, belonging to neither. His condition is the condition of those who have been placed outside every available category."</w:t>
       </w:r>
     </w:p>
     <w:p>
@@ -240,22 +494,47 @@
     </w:p>
     <w:p>
       <w:r>
-        <w:t>Elara's eyes lifted. The connection had appeared too precisely to dismiss. For the first time, she understood why the cards were in the room. Draṣṭā had not needed to ask about the boys. She had seen the shape of their condition before Elara had spoken it aloud. The seer did not merely read the card. She read the life gathered around it.</w:t>
+        <w:lastRenderedPageBreak/>
+        <w:t>Elara's eyes lifted. The connection had appeared too precisely to dismiss. For the first time, she understood why the cards were in the room. Dra</w:t>
+      </w:r>
+      <w:r>
+        <w:t>ṣṭ</w:t>
+      </w:r>
+      <w:r>
+        <w:t>ā had not needed to ask about the boys. She had seen the shape of their condition before Elara had spoken it aloud. The seer did not merely read the card. She read the life gathered around it.</w:t>
       </w:r>
     </w:p>
     <w:p>
       <w:r>
-        <w:t>"Now choose the second card," Draṣṭā said.</w:t>
+        <w:t>"Now choose the second card," Dra</w:t>
+      </w:r>
+      <w:r>
+        <w:t>ṣṭ</w:t>
+      </w:r>
+      <w:r>
+        <w:t>ā said.</w:t>
       </w:r>
     </w:p>
     <w:p>
       <w:r>
-        <w:t>Elara reached for the next card in the fan. Draṣṭā unfolded it, and the image showed a warrior standing beneath a ruined sky, his weapon lowered but not surrendered. Beneath him, in dark lettering, was a single name: *Ashwatthama*.</w:t>
+        <w:t>Elara reached for the next card in the fan. Dra</w:t>
+      </w:r>
+      <w:r>
+        <w:t>ṣṭ</w:t>
+      </w:r>
+      <w:r>
+        <w:t>ā unfolded it, and the image showed a warrior standing beneath a ruined sky, his weapon lowered but not surrendered. Beneath him, in dark lettering, was a single name: *Ashwatthama*.</w:t>
       </w:r>
     </w:p>
     <w:p>
       <w:r>
-        <w:t>"Ashwatthama," Draṣṭā said. "Conflict that cannot be terminated. He loosed a weapon at an unborn child after the war had already been decided, and for that act he was cursed to survive without relief. The battle ended. The conflict did not."</w:t>
+        <w:t>"Ashwatthama," Dra</w:t>
+      </w:r>
+      <w:r>
+        <w:t>ṣṭ</w:t>
+      </w:r>
+      <w:r>
+        <w:t>ā said. "Conflict that cannot be terminated. He loosed a weapon at an unborn child after the war had already been decided, and for that act he was cursed to survive without relief. The battle ended. The conflict did not."</w:t>
       </w:r>
     </w:p>
     <w:p>
@@ -275,17 +554,35 @@
     </w:p>
     <w:p>
       <w:r>
-        <w:t>Draṣṭā gathered the remaining cards into a smaller fan. "Draw the final card."</w:t>
+        <w:t>Dra</w:t>
+      </w:r>
+      <w:r>
+        <w:t>ṣṭ</w:t>
+      </w:r>
+      <w:r>
+        <w:t>ā gathered the remaining cards into a smaller fan. "Draw the final card."</w:t>
       </w:r>
     </w:p>
     <w:p>
       <w:r>
-        <w:t>Elara reached for the last card. Draṣṭā unfolded it slowly. The image showed a severed head rising against a darkened sun, its mouth open as if it were trying to swallow the light. Beneath it was the name *Rahu*.</w:t>
+        <w:t>Elara reached for the last card. Dra</w:t>
+      </w:r>
+      <w:r>
+        <w:t>ṣṭ</w:t>
+      </w:r>
+      <w:r>
+        <w:t>ā unfolded it slowly. The image showed a severed head rising against a darkened sun, its mouth open as if it were trying to swallow the light. Beneath it was the name *Rahu*.</w:t>
       </w:r>
     </w:p>
     <w:p>
       <w:r>
-        <w:t>"Rahu," Draṣṭā said. "The severed head of an asura who drank the stolen amrita. The nectar reached his throat before Vishnu cut him in two, and so he remained alive without the body that could have made him whole. He pursues the sun and moon forever and swallows them at eclipses, but he cannot hold them. They always emerge."</w:t>
+        <w:t>"Rahu," Dra</w:t>
+      </w:r>
+      <w:r>
+        <w:t>ṣṭ</w:t>
+      </w:r>
+      <w:r>
+        <w:t>ā said. "The severed head of an asura who drank the stolen amrita. The nectar reached his throat before Vishnu cut him in two, and so he remained alive without the body that could have made him whole. He pursues the sun and moon forever and swallows them at eclipses, but he cannot hold them. They always emerge."</w:t>
       </w:r>
     </w:p>
     <w:p>
@@ -295,12 +592,19 @@
     </w:p>
     <w:p>
       <w:r>
+        <w:lastRenderedPageBreak/>
         <w:t>Elara looked at the three cards together. Trishanku, Ashwatthama, and Rahu were not promises of what must happen. They were patterns: suspension, conflict, and danger closing without resolution. She could not change what had already happened in the monitoring chamber. She could only respond to what was happening now. The final card made the next obligation clear. The present was the last time she could prepare for what was coming.</w:t>
       </w:r>
     </w:p>
     <w:p>
       <w:r>
-        <w:t>Draṣṭā's expression grew solemn. "The past cannot be changed by regret, Elara; the present must be met by action; and the future often warns us before it arrives. These are signals of grave times. Prepare while preparation is still possible."</w:t>
+        <w:t>Dra</w:t>
+      </w:r>
+      <w:r>
+        <w:t>ṣṭ</w:t>
+      </w:r>
+      <w:r>
+        <w:t>ā's expression grew solemn. "The past cannot be changed by regret, Elara; the present must be met by action; and the future often warns us before it arrives. These are signals of grave times. Prepare while preparation is still possible."</w:t>
       </w:r>
     </w:p>
     <w:p>
@@ -320,7 +624,13 @@
     </w:p>
     <w:p>
       <w:r>
-        <w:t>Elara understood the difference: Draṣṭā read patterns and possibilities, while Sarvajña dealt in documented facts and the consequences of what the ganas had done.</w:t>
+        <w:t>Elara understood the difference: Dra</w:t>
+      </w:r>
+      <w:r>
+        <w:t>ṣṭ</w:t>
+      </w:r>
+      <w:r>
+        <w:t>ā read patterns and possibilities, while Sarvajña dealt in documented facts and the consequences of what the ganas had done.</w:t>
       </w:r>
     </w:p>
     <w:p>
@@ -330,12 +640,22 @@
     </w:p>
     <w:p>
       <w:r>
-        <w:t>He glanced toward the three cards. "That work has kept old grievances from becoming open war, but balance is not resolution. While we have focused on the scales, something indescribable has begun to form beneath them. I agree with Draṣṭā. The danger is grave, and it is no longer contained by the arguments we have used to manage the past."</w:t>
+        <w:t>He glanced toward the three cards. "That work has kept old grievances from becoming open war, but balance is not resolution. While we have focused on the scales, something indescribable has begun to form beneath them. I agree with Dra</w:t>
+      </w:r>
+      <w:r>
+        <w:t>ṣṭ</w:t>
+      </w:r>
+      <w:r>
+        <w:t>ā. The danger is grave, and it is no longer contained by the arguments we have used to manage the past."</w:t>
       </w:r>
     </w:p>
     <w:p>
       <w:r>
-        <w:t>Sarvajña's fingers rested against the stones at his wrist. "A new wing of the Drona library was sanctioned this month. The section had been blocked for more than a decade. The approval came with twice the amount originally allocated, but no clear designation for what the additional funds were meant to support. When we carried the order to the treasury, to Kubera, there was a pause before the transfer was released. Conversations took place in closed rooms."</w:t>
+        <w:t xml:space="preserve">Sarvajña's fingers rested against the stones at his wrist. "A new wing of the Drona library was sanctioned this month. The section had been blocked for more than a decade. The approval came with twice the amount originally allocated, but no clear designation for what the additional funds were meant to support. When we carried the order to the treasury, to </w:t>
+      </w:r>
+      <w:r>
+        <w:lastRenderedPageBreak/>
+        <w:t>Kubera, there was a pause before the transfer was released. Conversations took place in closed rooms."</w:t>
       </w:r>
     </w:p>
     <w:p>

</xml_diff>

<commit_message>
Ch8/10/11 library-transfer chronology repair (frozen at Ch8, released+doubled by Ch10, Drona-approval vs Kubera-funding in Ch11), Sarvajña balance/connection argument, card-scene fixes + tracker: glossary stories, pronunciations (print+audiobook), epigraph relevance test
</commit_message>
<xml_diff>
--- a/manuscript/chapter-08-the-silence.docx
+++ b/manuscript/chapter-08-the-silence.docx
@@ -8,6 +8,7 @@
       </w:pPr>
       <w:r>
         <w:rPr>
+          <w:b/>
           <w:color w:val="000000"/>
         </w:rPr>
         <w:t>Chapter 8: The Silence</w:t>
@@ -49,10 +50,7 @@
     </w:p>
     <w:p>
       <w:r>
-        <w:t>The effect was instant and violent. Elara's chest lurched upward with a desperate gasp as her lungs seized, then opened. She bent over the table, clutching her collar as ragged breaths tore at her throat; it felt like drowning and being dragged back onto a deck at the same time. Her body still shuddered, her eyes watered, and her pulse thundered as she forced herself upright. Then she understood what the room had seen: the elder woman had tested control from inside her body, treating Elara's ability to spea</w:t>
-      </w:r>
-      <w:r>
-        <w:t>k and breathe as something the committee could grant or withhold. Lowering her hand did not soften the lesson. It confirmed that her panic had been instruction, a deliberate demonstration.</w:t>
+        <w:t>The effect was instant and violent. Elara's chest lurched upward with a desperate gasp as her lungs seized, then opened. She bent over the table, clutching her collar as ragged breaths tore at her throat; it felt like drowning and being dragged back onto a deck at the same time. Her body still shuddered, her eyes watered, and her pulse thundered as she forced herself upright. Then she understood what the room had seen: the elder woman had tested control from inside her body, treating Elara's ability to speak and breathe as something the committee could grant or withhold. Lowering her hand did not soften the lesson. It confirmed that her panic had been instruction, a deliberate demonstration.</w:t>
       </w:r>
     </w:p>
     <w:p>
@@ -72,119 +70,7 @@
     </w:p>
     <w:p>
       <w:r>
-        <w:t xml:space="preserve">And then, at last, the elder woman spoke, and the words came in Sanskrit — the oldest of the carried tongues, the language in which knowledge had first passed from teacher to student by voice alone, each syllable engineered for precision and kept alive through millennia of recitation. It was the language of the scriptures in Vishnu's cabinet, older than </w:t>
-      </w:r>
-      <w:r>
-        <w:lastRenderedPageBreak/>
-        <w:t>Trinity, older than the cities Trinity had replaced. "</w:t>
-      </w:r>
-      <w:r>
-        <w:t>मोनितोरा</w:t>
-      </w:r>
-      <w:r>
-        <w:t xml:space="preserve"> </w:t>
-      </w:r>
-      <w:r>
-        <w:t>नातन</w:t>
-      </w:r>
-      <w:r>
-        <w:t xml:space="preserve">, </w:t>
-      </w:r>
-      <w:r>
-        <w:t>अधुना</w:t>
-      </w:r>
-      <w:r>
-        <w:t xml:space="preserve"> </w:t>
-      </w:r>
-      <w:r>
-        <w:t>वक्तुं</w:t>
-      </w:r>
-      <w:r>
-        <w:t xml:space="preserve"> </w:t>
-      </w:r>
-      <w:r>
-        <w:t>अर्हसि।</w:t>
-      </w:r>
-      <w:r>
-        <w:t xml:space="preserve"> </w:t>
-      </w:r>
-      <w:r>
-        <w:t>अपि</w:t>
-      </w:r>
-      <w:r>
-        <w:t xml:space="preserve"> </w:t>
-      </w:r>
-      <w:r>
-        <w:t>च</w:t>
-      </w:r>
-      <w:r>
-        <w:t xml:space="preserve">, </w:t>
-      </w:r>
-      <w:r>
-        <w:t>यानि</w:t>
-      </w:r>
-      <w:r>
-        <w:t xml:space="preserve"> </w:t>
-      </w:r>
-      <w:r>
-        <w:t>अस्माभिः</w:t>
-      </w:r>
-      <w:r>
-        <w:t xml:space="preserve"> </w:t>
-      </w:r>
-      <w:r>
-        <w:t>परिकल्पितानि</w:t>
-      </w:r>
-      <w:r>
-        <w:t xml:space="preserve"> </w:t>
-      </w:r>
-      <w:r>
-        <w:t>प्रश्नानि</w:t>
-      </w:r>
-      <w:r>
-        <w:t xml:space="preserve"> </w:t>
-      </w:r>
-      <w:r>
-        <w:t>तानि</w:t>
-      </w:r>
-      <w:r>
-        <w:t xml:space="preserve"> </w:t>
-      </w:r>
-      <w:r>
-        <w:t>एव</w:t>
-      </w:r>
-      <w:r>
-        <w:t xml:space="preserve"> </w:t>
-      </w:r>
-      <w:r>
-        <w:t>तेओभ्युपगच्छन्तु</w:t>
-      </w:r>
-      <w:r>
-        <w:t xml:space="preserve">, </w:t>
-      </w:r>
-      <w:r>
-        <w:t>न</w:t>
-      </w:r>
-      <w:r>
-        <w:t xml:space="preserve"> </w:t>
-      </w:r>
-      <w:r>
-        <w:t>तु</w:t>
-      </w:r>
-      <w:r>
-        <w:t xml:space="preserve"> </w:t>
-      </w:r>
-      <w:r>
-        <w:t>स्वस्यात्मनः</w:t>
-      </w:r>
-      <w:r>
-        <w:t xml:space="preserve"> </w:t>
-      </w:r>
-      <w:r>
-        <w:t>परिकल्पितानि।</w:t>
-      </w:r>
-      <w:r>
-        <w:t>"</w:t>
+        <w:t>And then, at last, the elder woman spoke, and the words came in Sanskrit — the oldest of the carried tongues, the language in which knowledge had first passed from teacher to student by voice alone, each syllable engineered for precision and kept alive through millennia of recitation. It was the language of the scriptures in Vishnu's cabinet, older than Trinity, older than the cities Trinity had replaced. "मोनितोरा नातन, अधुना वक्तुं अर्हसि। अपि च, यानि अस्माभिः परिकल्पितानि प्रश्नानि तानि एव तेओभ्युपगच्छन्तु, न तु स्वस्यात्मनः परिकल्पितानि।"</w:t>
       </w:r>
     </w:p>
     <w:p>
@@ -214,10 +100,7 @@
     </w:p>
     <w:p>
       <w:r>
-        <w:t>She should have expected that. Anandi had told her this in the early days at Drona Academy, before Elara had learned how much of wisdom was simply the ability to survive being humbled. "Just when you think you have seen it all," Anandi had said, her voice quiet and impossible to argue with, "life will throw you a surprise and remind you that you still have a very long way to go." Elara had laughed then, because she had been young and certain she was already learning the shape of the world. Now, with her bre</w:t>
-      </w:r>
-      <w:r>
-        <w:t>ath still uneven and her throat raw from panic, she understood the lesson with the kind of clarity that only came after a fall.</w:t>
+        <w:t>She should have expected that. Anandi had told her this in the early days at Drona Academy, before Elara had learned how much of wisdom was simply the ability to survive being humbled. "Just when you think you have seen it all," Anandi had said, her voice quiet and impossible to argue with, "life will throw you a surprise and remind you that you still have a very long way to go." Elara had laughed then, because she had been young and certain she was already learning the shape of the world. Now, with her breath still uneven and her throat raw from panic, she understood the lesson with the kind of clarity that only came after a fall.</w:t>
       </w:r>
     </w:p>
     <w:p>
@@ -237,91 +120,7 @@
     </w:p>
     <w:p>
       <w:r>
-        <w:t>"</w:t>
-      </w:r>
-      <w:r>
-        <w:t>प्रवृत्तेः</w:t>
-      </w:r>
-      <w:r>
-        <w:t xml:space="preserve"> </w:t>
-      </w:r>
-      <w:r>
-        <w:t>पूर्वम्</w:t>
-      </w:r>
-      <w:r>
-        <w:t>," the elder woman said in the same ancient cadence. "</w:t>
-      </w:r>
-      <w:r>
-        <w:t>अद्य</w:t>
-      </w:r>
-      <w:r>
-        <w:t xml:space="preserve"> </w:t>
-      </w:r>
-      <w:r>
-        <w:t>अस्यां</w:t>
-      </w:r>
-      <w:r>
-        <w:t xml:space="preserve"> </w:t>
-      </w:r>
-      <w:r>
-        <w:t>सभायाम्</w:t>
-      </w:r>
-      <w:r>
-        <w:t xml:space="preserve"> </w:t>
-      </w:r>
-      <w:r>
-        <w:t>उपविष्टेभ्यः</w:t>
-      </w:r>
-      <w:r>
-        <w:t xml:space="preserve"> </w:t>
-      </w:r>
-      <w:r>
-        <w:t>आचार्येभ्यः</w:t>
-      </w:r>
-      <w:r>
-        <w:t xml:space="preserve"> </w:t>
-      </w:r>
-      <w:r>
-        <w:t>उचितम्</w:t>
-      </w:r>
-      <w:r>
-        <w:t xml:space="preserve"> </w:t>
-      </w:r>
-      <w:r>
-        <w:t>आदरं</w:t>
-      </w:r>
-      <w:r>
-        <w:t xml:space="preserve"> </w:t>
-      </w:r>
-      <w:r>
-        <w:t>दर्शयत।</w:t>
-      </w:r>
-      <w:r>
-        <w:t xml:space="preserve"> </w:t>
-      </w:r>
-      <w:r>
-        <w:t>आचार्याः</w:t>
-      </w:r>
-      <w:r>
-        <w:t xml:space="preserve"> </w:t>
-      </w:r>
-      <w:r>
-        <w:t>एकैकशः</w:t>
-      </w:r>
-      <w:r>
-        <w:t xml:space="preserve"> </w:t>
-      </w:r>
-      <w:r>
-        <w:t>स्वपरिचयं</w:t>
-      </w:r>
-      <w:r>
-        <w:t xml:space="preserve"> </w:t>
-      </w:r>
-      <w:r>
-        <w:t>कुर्वन्तु।</w:t>
-      </w:r>
-      <w:r>
-        <w:t>"</w:t>
+        <w:t>"प्रवृत्तेः पूर्वम्," the elder woman said in the same ancient cadence. "अद्य अस्यां सभायाम् उपविष्टेभ्यः आचार्येभ्यः उचितम् आदरं दर्शयत। आचार्याः एकैकशः स्वपरिचयं कुर्वन्तु।"</w:t>
       </w:r>
     </w:p>
     <w:p>
@@ -331,7 +130,6 @@
     </w:p>
     <w:p>
       <w:r>
-        <w:lastRenderedPageBreak/>
         <w:t>The language was formal and hierarchical, placing the room above Elara before she had permission to speak and revealing that this was not a routine review but an initiation into an authority beyond Trinity's procedures and policies.</w:t>
       </w:r>
     </w:p>
@@ -367,24 +165,12 @@
     </w:p>
     <w:p>
       <w:r>
-        <w:t>"I am Dra</w:t>
-      </w:r>
-      <w:r>
-        <w:t>ṣṭ</w:t>
-      </w:r>
-      <w:r>
-        <w:t>ā, the seer," she said. "My duty is to know the three times: the past, the present, and the future. Nothing is certain, and I do not pretend otherwise. I guide the gana toward choices whose significance may reach much farther into tomorrow than what appears today."</w:t>
+        <w:t>"I am Draṣṭā, the seer," she said. "My duty is to know the three times: the past, the present, and the future. Nothing is certain, and I do not pretend otherwise. I guide the gana toward choices whose significance may reach much farther into tomorrow than what appears today."</w:t>
       </w:r>
     </w:p>
     <w:p>
       <w:r>
-        <w:t>The third was the elder woman at the end of the table, and the room seemed to arrange itself around her silence. Sarvajña carried the authority of knowledge, Dra</w:t>
-      </w:r>
-      <w:r>
-        <w:t>ṣṭ</w:t>
-      </w:r>
-      <w:r>
-        <w:t>ā the authority of perception, and Anandi and Kavik the authority of those who had shaped Elara's mind; this woman stood above those distinctions, as if the room's laws and lineages had gathered in her rather than the other way around. When she spoke, her voice did not claim the room. It revealed that the room had always been hers to convene.</w:t>
+        <w:t>The third was the elder woman at the end of the table, and the room seemed to arrange itself around her silence. Sarvajña carried the authority of knowledge, Draṣṭā the authority of perception, and Anandi and Kavik the authority of those who had shaped Elara's mind; this woman stood above those distinctions, as if the room's laws and lineages had gathered in her rather than the other way around. When she spoke, her voice did not claim the room. It revealed that the room had always been hers to convene.</w:t>
       </w:r>
     </w:p>
     <w:p>
@@ -399,7 +185,6 @@
     </w:p>
     <w:p>
       <w:r>
-        <w:lastRenderedPageBreak/>
         <w:t>The Grandmaster's gaze moved toward the two familiar faces. "You know, of course, your mentors Anandi and Kavik. They have guided you longer than you realize."</w:t>
       </w:r>
     </w:p>
@@ -410,49 +195,27 @@
     </w:p>
     <w:p>
       <w:r>
-        <w:t>The Grandmaster gave a small signal toward Dra</w:t>
-      </w:r>
-      <w:r>
-        <w:t>ṣṭ</w:t>
-      </w:r>
-      <w:r>
-        <w:t>ā. The seer gathered the cards into a single stack, then spread them across the table in a long, uneven fan. Their dark backs caught the light without revealing anything beneath them.</w:t>
+        <w:t>The Grandmaster gave a small signal toward Draṣṭā. The seer gathered the cards into a single stack, then spread them across the table in a long, uneven fan. Their dark backs caught the light without revealing anything beneath them.</w:t>
       </w:r>
     </w:p>
     <w:p>
       <w:r>
-        <w:t>"Choose one," Dra</w:t>
-      </w:r>
-      <w:r>
-        <w:t>ṣṭ</w:t>
-      </w:r>
-      <w:r>
-        <w:t>ā said.</w:t>
+        <w:t>"Choose one," Draṣṭā said.</w:t>
       </w:r>
     </w:p>
     <w:p>
       <w:r>
-        <w:rPr>
-          <w:highlight w:val="yellow"/>
-        </w:rPr>
-        <w:t>Dra</w:t>
-      </w:r>
-      <w:r>
-        <w:rPr>
-          <w:highlight w:val="yellow"/>
-        </w:rPr>
-        <w:t>ṣṭ</w:t>
-      </w:r>
-      <w:r>
-        <w:rPr>
-          <w:highlight w:val="yellow"/>
-        </w:rPr>
-        <w:t>ā looked at her and smiled faintly. It was not an amused smile. It was the quiet expression of someone who had recognized Elara's confusion before Elara had found the words for it, as if the question had already crossed the space between them without being spoken.</w:t>
+        <w:t>*Why?* The question rose at once — and stopped behind Elara's teeth. The elder woman's instruction still governed the room: only the questions the council had devised were hers to take up, none of her own. She had never felt the cost of that rule so precisely as now, holding a question she was not permitted to ask.</w:t>
       </w:r>
     </w:p>
     <w:p>
       <w:r>
-        <w:t>Elara looked from the cards to the faces around the table. The request struck her as strange. If the elders had gathered to share news this grave, then something foul, difficult, or dangerous was already in motion. Perhaps something worse than that. Picking a card could not make the situation certain. It was a choice, and a choice was not certainty. It was only the act of placing her hand upon one possibility while the others remained hidden.</w:t>
+        <w:t>Draṣṭā looked at her and smiled faintly. It was not an amused smile. It was the quiet expression of someone who had recognized the swallowed question, as if it had crossed the space between them without being spoken. She offered no answer. She only waited.</w:t>
+      </w:r>
+    </w:p>
+    <w:p>
+      <w:r>
+        <w:t>Elara looked from the cards to the faces around the table. If the elders had gathered to share news this grave, then the danger already existed — a card would not create it, and refusing one would not cancel it. Whatever the drawing was for, it would cost her nothing the room had not already decided to take.</w:t>
       </w:r>
     </w:p>
     <w:p>
@@ -462,24 +225,12 @@
     </w:p>
     <w:p>
       <w:r>
-        <w:t>Dra</w:t>
-      </w:r>
-      <w:r>
-        <w:t>ṣṭ</w:t>
-      </w:r>
-      <w:r>
-        <w:t>ā took it from her fingers and unfolded it with deliberate care. The card showed a king suspended between a dark sky and the curve of the earth below him, neither ascending nor falling. Beneath the image, in old lettering, was a single name: *Trishanku*.</w:t>
+        <w:t>Draṣṭā took it from her fingers and unfolded it with deliberate care. The card showed a king suspended between a dark sky and the curve of the earth below him, neither ascending nor falling. Beneath the image, in old lettering, was a single name: *Trishanku*.</w:t>
       </w:r>
     </w:p>
     <w:p>
       <w:r>
-        <w:t>"King Trishanku," Dra</w:t>
-      </w:r>
-      <w:r>
-        <w:t>ṣṭ</w:t>
-      </w:r>
-      <w:r>
-        <w:t>ā said, a faint smile still resting at the edge of her mouth. "He was pushed out of heaven and prevented from falling back to earth, left fixed in the space between the two, belonging to neither. His condition is the condition of those who have been placed outside every available category."</w:t>
+        <w:t>"King Trishanku," Draṣṭā said, a faint smile still resting at the edge of her mouth. "He was pushed out of heaven and prevented from falling back to earth, left fixed in the space between the two, belonging to neither. His condition is the condition of those who have been placed outside every available category."</w:t>
       </w:r>
     </w:p>
     <w:p>
@@ -494,47 +245,22 @@
     </w:p>
     <w:p>
       <w:r>
-        <w:lastRenderedPageBreak/>
-        <w:t>Elara's eyes lifted. The connection had appeared too precisely to dismiss. For the first time, she understood why the cards were in the room. Dra</w:t>
-      </w:r>
-      <w:r>
-        <w:t>ṣṭ</w:t>
-      </w:r>
-      <w:r>
-        <w:t>ā had not needed to ask about the boys. She had seen the shape of their condition before Elara had spoken it aloud. The seer did not merely read the card. She read the life gathered around it.</w:t>
+        <w:t>Elara's eyes lifted. The connection had appeared too precisely to dismiss. For the first time, she understood why the cards were in the room. Draṣṭā had not needed to ask about the boys. She had seen the shape of their condition before Elara had spoken it aloud. The seer did not merely read the card. She read the life gathered around it.</w:t>
       </w:r>
     </w:p>
     <w:p>
       <w:r>
-        <w:t>"Now choose the second card," Dra</w:t>
-      </w:r>
-      <w:r>
-        <w:t>ṣṭ</w:t>
-      </w:r>
-      <w:r>
-        <w:t>ā said.</w:t>
+        <w:t>"Now choose the second card," Draṣṭā said.</w:t>
       </w:r>
     </w:p>
     <w:p>
       <w:r>
-        <w:t>Elara reached for the next card in the fan. Dra</w:t>
-      </w:r>
-      <w:r>
-        <w:t>ṣṭ</w:t>
-      </w:r>
-      <w:r>
-        <w:t>ā unfolded it, and the image showed a warrior standing beneath a ruined sky, his weapon lowered but not surrendered. Beneath him, in dark lettering, was a single name: *Ashwatthama*.</w:t>
+        <w:t>Elara reached for the next card in the fan. Draṣṭā unfolded it, and the image showed a warrior standing beneath a ruined sky, his weapon lowered but not surrendered. Beneath him, in dark lettering, was a single name: *Ashwatthama*.</w:t>
       </w:r>
     </w:p>
     <w:p>
       <w:r>
-        <w:t>"Ashwatthama," Dra</w:t>
-      </w:r>
-      <w:r>
-        <w:t>ṣṭ</w:t>
-      </w:r>
-      <w:r>
-        <w:t>ā said. "Conflict that cannot be terminated. He loosed a weapon at an unborn child after the war had already been decided, and for that act he was cursed to survive without relief. The battle ended. The conflict did not."</w:t>
+        <w:t>"Ashwatthama," Draṣṭā said. "Conflict that cannot be terminated. He loosed a weapon at an unborn child after the war had already been decided, and for that act he was cursed to survive without relief. The battle ended. The conflict did not."</w:t>
       </w:r>
     </w:p>
     <w:p>
@@ -554,35 +280,17 @@
     </w:p>
     <w:p>
       <w:r>
-        <w:t>Dra</w:t>
-      </w:r>
-      <w:r>
-        <w:t>ṣṭ</w:t>
-      </w:r>
-      <w:r>
-        <w:t>ā gathered the remaining cards into a smaller fan. "Draw the final card."</w:t>
+        <w:t>Draṣṭā gathered the remaining cards into a smaller fan. "Draw the final card."</w:t>
       </w:r>
     </w:p>
     <w:p>
       <w:r>
-        <w:t>Elara reached for the last card. Dra</w:t>
-      </w:r>
-      <w:r>
-        <w:t>ṣṭ</w:t>
-      </w:r>
-      <w:r>
-        <w:t>ā unfolded it slowly. The image showed a severed head rising against a darkened sun, its mouth open as if it were trying to swallow the light. Beneath it was the name *Rahu*.</w:t>
+        <w:t>Elara reached for the last card. Draṣṭā unfolded it slowly. The image showed a severed head rising against a darkened sun, its mouth open as if it were trying to swallow the light. Beneath it was the name *Rahu*.</w:t>
       </w:r>
     </w:p>
     <w:p>
       <w:r>
-        <w:t>"Rahu," Dra</w:t>
-      </w:r>
-      <w:r>
-        <w:t>ṣṭ</w:t>
-      </w:r>
-      <w:r>
-        <w:t>ā said. "The severed head of an asura who drank the stolen amrita. The nectar reached his throat before Vishnu cut him in two, and so he remained alive without the body that could have made him whole. He pursues the sun and moon forever and swallows them at eclipses, but he cannot hold them. They always emerge."</w:t>
+        <w:t>"Rahu," Draṣṭā said. "The severed head of an asura who drank the stolen amrita. The nectar reached his throat before Vishnu cut him in two, and so he remained alive without the body that could have made him whole. He pursues the sun and moon forever and swallows them at eclipses, but he cannot hold them. They always emerge."</w:t>
       </w:r>
     </w:p>
     <w:p>
@@ -592,19 +300,12 @@
     </w:p>
     <w:p>
       <w:r>
-        <w:lastRenderedPageBreak/>
         <w:t>Elara looked at the three cards together. Trishanku, Ashwatthama, and Rahu were not promises of what must happen. They were patterns: suspension, conflict, and danger closing without resolution. She could not change what had already happened in the monitoring chamber. She could only respond to what was happening now. The final card made the next obligation clear. The present was the last time she could prepare for what was coming.</w:t>
       </w:r>
     </w:p>
     <w:p>
       <w:r>
-        <w:t>Dra</w:t>
-      </w:r>
-      <w:r>
-        <w:t>ṣṭ</w:t>
-      </w:r>
-      <w:r>
-        <w:t>ā's expression grew solemn. "The past cannot be changed by regret, Elara; the present must be met by action; and the future often warns us before it arrives. These are signals of grave times. Prepare while preparation is still possible."</w:t>
+        <w:t>Draṣṭā's expression grew solemn. "The past cannot be changed by regret, Elara; the present must be met by action; and the future often warns us before it arrives. These are signals of grave times. Prepare while preparation is still possible."</w:t>
       </w:r>
     </w:p>
     <w:p>
@@ -624,13 +325,7 @@
     </w:p>
     <w:p>
       <w:r>
-        <w:t>Elara understood the difference: Dra</w:t>
-      </w:r>
-      <w:r>
-        <w:t>ṣṭ</w:t>
-      </w:r>
-      <w:r>
-        <w:t>ā read patterns and possibilities, while Sarvajña dealt in documented facts and the consequences of what the ganas had done.</w:t>
+        <w:t>Elara understood the difference: Draṣṭā read patterns and possibilities, while Sarvajña dealt in documented facts and the consequences of what the ganas had done.</w:t>
       </w:r>
     </w:p>
     <w:p>
@@ -640,32 +335,27 @@
     </w:p>
     <w:p>
       <w:r>
-        <w:t>He glanced toward the three cards. "That work has kept old grievances from becoming open war, but balance is not resolution. While we have focused on the scales, something indescribable has begun to form beneath them. I agree with Dra</w:t>
-      </w:r>
-      <w:r>
-        <w:t>ṣṭ</w:t>
-      </w:r>
-      <w:r>
-        <w:t>ā. The danger is grave, and it is no longer contained by the arguments we have used to manage the past."</w:t>
+        <w:t>He glanced toward the three cards. "That work has kept old grievances from becoming open war, but balance is not resolution. While we have focused on the scales, something indescribable has begun to form beneath them. I agree with Draṣṭā. The danger is grave, and it is no longer contained by the arguments we have used to manage the past."</w:t>
       </w:r>
     </w:p>
     <w:p>
       <w:r>
-        <w:t xml:space="preserve">Sarvajña's fingers rested against the stones at his wrist. "A new wing of the Drona library was sanctioned this month. The section had been blocked for more than a decade. The approval came with twice the amount originally allocated, but no clear designation for what the additional funds were meant to support. When we carried the order to the treasury, to </w:t>
-      </w:r>
-      <w:r>
-        <w:lastRenderedPageBreak/>
-        <w:t>Kubera, there was a pause before the transfer was released. Conversations took place in closed rooms."</w:t>
+        <w:t>Sarvajñā's fingers rested against the stones at his wrist. "A proposal for a new wing of the Drona library cleared the gana's internal review this month. The section had been blocked for more than a decade. But when we carried the request to the treasury, to Kubera, the funds did not move. Conversations took place in closed rooms. The transfer has still not been released."</w:t>
       </w:r>
     </w:p>
     <w:p>
       <w:r>
-        <w:t>"Our sources tell us that a new power is gathering inside Kubera. It has no name, no public office, and no designation that can be entered into a record. Yet every account describes the same impression: someone extraordinarily strong, almost omnipotent in reach, is being built behind the institution's visible structure. A person like that cannot exist without complete support. Not from one elder, or one department, but from the entire chain of authority in Kubera, all the way to its Grandmaster."</w:t>
+        <w:t>"Our sources tell us that a new power is gathering inside Kubera. It has no name, no public office, and no designation that can be entered into a record. Yet every account describes the same impression: for months, something extraordinarily strong — almost omnipotent in reach — has been taking shape behind the institution's visible structure, waiting only for the hand that will wield it. A power like that cannot be built without complete support. Not from one elder, or one department, but from the entire chain of authority in Kubera, all the way to its Grandmaster."</w:t>
       </w:r>
     </w:p>
     <w:p>
       <w:r>
-        <w:t>Sarvajña's gaze returned to Elara. "We believe this is connected to the events surrounding you during these past few days. The balance between the ganas held only because every action could still be weighed against an answering action. That balance has now slipped beyond anything ordinary judgment can restore, and what is coming will not arrive as a single act we can measure or contain. You will stand at the center of it, Elara, when the consequences of these days begin to unfold."</w:t>
+        <w:t>Sarvajña's gaze returned to Elara. "Understand what a nameless power does to the balance. The scales the elders keep have held for generations because every action carried a name, and every action could be weighed against an answering action. A power that cannot be entered into a record cannot be weighed, and what cannot be weighed cannot be answered. Whatever this is, it has placed itself beyond the oldest instrument we possess."</w:t>
+      </w:r>
+    </w:p>
+    <w:p>
+      <w:r>
+        <w:t>"And we believe your Initiation stands among its first concerns. Kubera's representative moved against your candidates and failed — in front of the other ganas, on footage every house has quietly seen. He has since disappeared from Kubera's rolls. Our library request sits frozen in Kubera's treasury. And in these same weeks, every account of the gathering power has grown firmer. Kubera does not record its humiliations as accidents, and a power built to leave no record will not answer this one through recorded channels. What is coming will not arrive as a single act we can measure or contain. You will stand at the center of it, Elara, when the consequences of these days begin to unfold."</w:t>
       </w:r>
     </w:p>
     <w:p>

</xml_diff>